<commit_message>
Update Cyril Efren Fabro resume files
Replace DOCX and PDF resume files for Cyril Efren Fabro with updated versions. Binary files changed to reflect the latest resume content.
</commit_message>
<xml_diff>
--- a/Resume/Cyril_Efren_Fabro_Resume.docx
+++ b/Resume/Cyril_Efren_Fabro_Resume.docx
@@ -1,6 +1,6 @@
 
 <file path=word/document.xml><?xml version="1.0" encoding="utf-8"?>
-<w:document xmlns:wpc="http://schemas.microsoft.com/office/word/2010/wordprocessingCanvas" xmlns:cx="http://schemas.microsoft.com/office/drawing/2014/chartex" xmlns:cx1="http://schemas.microsoft.com/office/drawing/2015/9/8/chartex" xmlns:cx2="http://schemas.microsoft.com/office/drawing/2015/10/21/chartex" xmlns:cx3="http://schemas.microsoft.com/office/drawing/2016/5/9/chartex" xmlns:cx4="http://schemas.microsoft.com/office/drawing/2016/5/10/chartex" xmlns:cx5="http://schemas.microsoft.com/office/drawing/2016/5/11/chartex" xmlns:cx6="http://schemas.microsoft.com/office/drawing/2016/5/12/chartex" xmlns:cx7="http://schemas.microsoft.com/office/drawing/2016/5/13/chartex" xmlns:cx8="http://schemas.microsoft.com/office/drawing/2016/5/14/chartex" xmlns:mc="http://schemas.openxmlformats.org/markup-compatibility/2006" xmlns:aink="http://schemas.microsoft.com/office/drawing/2016/ink" xmlns:am3d="http://schemas.microsoft.com/office/drawing/2017/model3d" xmlns:o="urn:schemas-microsoft-com:office:office" xmlns:oel="http://schemas.microsoft.com/office/2019/extlst" xmlns:r="http://schemas.openxmlformats.org/officeDocument/2006/relationships" xmlns:m="http://schemas.openxmlformats.org/officeDocument/2006/math" xmlns:v="urn:schemas-microsoft-com:vml" xmlns:wp14="http://schemas.microsoft.com/office/word/2010/wordprocessingDrawing" xmlns:wp="http://schemas.openxmlformats.org/drawingml/2006/wordprocessingDrawing" xmlns:w10="urn:schemas-microsoft-com:office:word" xmlns:w="http://schemas.openxmlformats.org/wordprocessingml/2006/main" xmlns:w14="http://schemas.microsoft.com/office/word/2010/wordml" xmlns:w15="http://schemas.microsoft.com/office/word/2012/wordml" xmlns:w16cex="http://schemas.microsoft.com/office/word/2018/wordml/cex" xmlns:w16cid="http://schemas.microsoft.com/office/word/2016/wordml/cid" xmlns:w16="http://schemas.microsoft.com/office/word/2018/wordml" xmlns:w16du="http://schemas.microsoft.com/office/word/2023/wordml/word16du" xmlns:w16sdtdh="http://schemas.microsoft.com/office/word/2020/wordml/sdtdatahash" xmlns:w16sdtfl="http://schemas.microsoft.com/office/word/2024/wordml/sdtformatlock" xmlns:w16se="http://schemas.microsoft.com/office/word/2015/wordml/symex" xmlns:wpg="http://schemas.microsoft.com/office/word/2010/wordprocessingGroup" xmlns:wpi="http://schemas.microsoft.com/office/word/2010/wordprocessingInk" xmlns:wne="http://schemas.microsoft.com/office/word/2006/wordml" xmlns:wps="http://schemas.microsoft.com/office/word/2010/wordprocessingShape" mc:Ignorable="w14 w15 w16se w16cid w16 w16cex w16sdtdh w16sdtfl w16du wp14">
+<w:document xmlns:wpc="http://schemas.microsoft.com/office/word/2010/wordprocessingCanvas" xmlns:cx="http://schemas.microsoft.com/office/drawing/2014/chartex" xmlns:cx1="http://schemas.microsoft.com/office/drawing/2015/9/8/chartex" xmlns:cx2="http://schemas.microsoft.com/office/drawing/2015/10/21/chartex" xmlns:cx3="http://schemas.microsoft.com/office/drawing/2016/5/9/chartex" xmlns:cx4="http://schemas.microsoft.com/office/drawing/2016/5/10/chartex" xmlns:cx5="http://schemas.microsoft.com/office/drawing/2016/5/11/chartex" xmlns:cx6="http://schemas.microsoft.com/office/drawing/2016/5/12/chartex" xmlns:cx7="http://schemas.microsoft.com/office/drawing/2016/5/13/chartex" xmlns:cx8="http://schemas.microsoft.com/office/drawing/2016/5/14/chartex" xmlns:mc="http://schemas.openxmlformats.org/markup-compatibility/2006" xmlns:aink="http://schemas.microsoft.com/office/drawing/2016/ink" xmlns:am3d="http://schemas.microsoft.com/office/drawing/2017/model3d" xmlns:o="urn:schemas-microsoft-com:office:office" xmlns:oel="http://schemas.microsoft.com/office/2019/extlst" xmlns:r="http://schemas.openxmlformats.org/officeDocument/2006/relationships" xmlns:m="http://schemas.openxmlformats.org/officeDocument/2006/math" xmlns:v="urn:schemas-microsoft-com:vml" xmlns:wp14="http://schemas.microsoft.com/office/word/2010/wordprocessingDrawing" xmlns:wp="http://schemas.openxmlformats.org/drawingml/2006/wordprocessingDrawing" xmlns:w10="urn:schemas-microsoft-com:office:word" xmlns:w="http://schemas.openxmlformats.org/wordprocessingml/2006/main" xmlns:w14="http://schemas.microsoft.com/office/word/2010/wordml" xmlns:w15="http://schemas.microsoft.com/office/word/2012/wordml" xmlns:w16cex="http://schemas.microsoft.com/office/word/2018/wordml/cex" xmlns:w16cid="http://schemas.microsoft.com/office/word/2016/wordml/cid" xmlns:w16="http://schemas.microsoft.com/office/word/2018/wordml" xmlns:w16sdtdh="http://schemas.microsoft.com/office/word/2020/wordml/sdtdatahash" xmlns:w16se="http://schemas.microsoft.com/office/word/2015/wordml/symex" xmlns:wpg="http://schemas.microsoft.com/office/word/2010/wordprocessingGroup" xmlns:wpi="http://schemas.microsoft.com/office/word/2010/wordprocessingInk" xmlns:wne="http://schemas.microsoft.com/office/word/2006/wordml" xmlns:wps="http://schemas.microsoft.com/office/word/2010/wordprocessingShape" mc:Ignorable="w14 w15 w16se w16cid w16 w16cex w16sdtdh wp14">
   <w:body>
     <w:p>
       <w:pPr>
@@ -42,27 +42,70 @@
         <w:r>
           <w:rPr>
             <w:rFonts w:ascii="Calibri" w:eastAsia="Calibri" w:hAnsi="Calibri" w:cs="Calibri"/>
+          </w:rPr>
+          <w:t>efrencyril@</w:t>
+        </w:r>
+        <w:r>
+          <w:rPr>
+            <w:rFonts w:ascii="Calibri" w:eastAsia="Calibri" w:hAnsi="Calibri" w:cs="Calibri"/>
+          </w:rPr>
+          <w:t>g</w:t>
+        </w:r>
+        <w:r>
+          <w:rPr>
+            <w:rFonts w:ascii="Calibri" w:eastAsia="Calibri" w:hAnsi="Calibri" w:cs="Calibri"/>
+          </w:rPr>
+          <w:t>mail.com</w:t>
+        </w:r>
+      </w:hyperlink>
+    </w:p>
+    <w:p>
+      <w:pPr>
+        <w:jc w:val="center"/>
+        <w:rPr>
+          <w:rFonts w:ascii="Calibri" w:eastAsia="Calibri" w:hAnsi="Calibri" w:cs="Calibri"/>
+        </w:rPr>
+      </w:pPr>
+      <w:hyperlink r:id="rId9" w:history="1">
+        <w:r>
+          <w:rPr>
+            <w:rFonts w:asciiTheme="majorHAnsi" w:hAnsiTheme="majorHAnsi" w:cstheme="majorHAnsi"/>
             <w:color w:val="1155CC"/>
             <w:u w:val="single"/>
           </w:rPr>
-          <w:t>efrencyril@gmail.com</w:t>
+          <w:t>G</w:t>
         </w:r>
-      </w:hyperlink>
-    </w:p>
-    <w:p>
-      <w:pPr>
-        <w:jc w:val="center"/>
-        <w:rPr>
-          <w:rFonts w:ascii="Calibri" w:eastAsia="Calibri" w:hAnsi="Calibri" w:cs="Calibri"/>
-        </w:rPr>
-      </w:pPr>
-      <w:hyperlink r:id="rId9" w:history="1">
         <w:r>
           <w:rPr>
-            <w:rStyle w:val="Hyperlink"/>
-            <w:rFonts w:ascii="Calibri" w:eastAsia="Calibri" w:hAnsi="Calibri" w:cs="Calibri"/>
+            <w:rFonts w:asciiTheme="majorHAnsi" w:hAnsiTheme="majorHAnsi" w:cstheme="majorHAnsi"/>
+            <w:color w:val="1155CC"/>
+            <w:u w:val="single"/>
           </w:rPr>
-          <w:t>GitHub</w:t>
+          <w:t>i</w:t>
+        </w:r>
+        <w:r>
+          <w:rPr>
+            <w:rFonts w:asciiTheme="majorHAnsi" w:hAnsiTheme="majorHAnsi" w:cstheme="majorHAnsi"/>
+            <w:color w:val="1155CC"/>
+            <w:u w:val="single"/>
+          </w:rPr>
+          <w:t>t</w:t>
+        </w:r>
+        <w:r>
+          <w:rPr>
+            <w:rFonts w:asciiTheme="majorHAnsi" w:hAnsiTheme="majorHAnsi" w:cstheme="majorHAnsi"/>
+            <w:color w:val="1155CC"/>
+            <w:u w:val="single"/>
+          </w:rPr>
+          <w:t>H</w:t>
+        </w:r>
+        <w:r>
+          <w:rPr>
+            <w:rFonts w:asciiTheme="majorHAnsi" w:hAnsiTheme="majorHAnsi" w:cstheme="majorHAnsi"/>
+            <w:color w:val="1155CC"/>
+            <w:u w:val="single"/>
+          </w:rPr>
+          <w:t>ub</w:t>
         </w:r>
       </w:hyperlink>
       <w:r>
@@ -74,16 +117,34 @@
       <w:hyperlink r:id="rId10" w:history="1">
         <w:r>
           <w:rPr>
-            <w:rStyle w:val="Hyperlink"/>
-            <w:rFonts w:ascii="Calibri" w:eastAsia="Calibri" w:hAnsi="Calibri" w:cs="Calibri"/>
+            <w:rFonts w:asciiTheme="majorHAnsi" w:hAnsiTheme="majorHAnsi" w:cstheme="majorHAnsi"/>
+            <w:color w:val="1155CC"/>
+            <w:u w:val="single"/>
           </w:rPr>
-          <w:t>LinkedIn</w:t>
+          <w:t>Link</w:t>
+        </w:r>
+        <w:r>
+          <w:rPr>
+            <w:rFonts w:asciiTheme="majorHAnsi" w:hAnsiTheme="majorHAnsi" w:cstheme="majorHAnsi"/>
+            <w:color w:val="1155CC"/>
+            <w:u w:val="single"/>
+          </w:rPr>
+          <w:t>e</w:t>
+        </w:r>
+        <w:r>
+          <w:rPr>
+            <w:rFonts w:asciiTheme="majorHAnsi" w:hAnsiTheme="majorHAnsi" w:cstheme="majorHAnsi"/>
+            <w:color w:val="1155CC"/>
+            <w:u w:val="single"/>
+          </w:rPr>
+          <w:t>dIn</w:t>
         </w:r>
       </w:hyperlink>
     </w:p>
     <w:p>
       <w:pPr>
         <w:pStyle w:val="Heading2"/>
+        <w:spacing w:line="240" w:lineRule="auto"/>
         <w:rPr>
           <w:rFonts w:ascii="Calibri" w:eastAsia="Calibri" w:hAnsi="Calibri" w:cs="Calibri"/>
           <w:b/>
@@ -109,6 +170,7 @@
     </w:p>
     <w:p>
       <w:pPr>
+        <w:spacing w:line="240" w:lineRule="auto"/>
         <w:rPr>
           <w:rFonts w:ascii="Calibri" w:eastAsia="Calibri" w:hAnsi="Calibri" w:cs="Calibri"/>
         </w:rPr>
@@ -185,6 +247,7 @@
     <w:p>
       <w:pPr>
         <w:pStyle w:val="Heading2"/>
+        <w:spacing w:line="240" w:lineRule="auto"/>
         <w:rPr>
           <w:rFonts w:ascii="Calibri" w:eastAsia="Calibri" w:hAnsi="Calibri" w:cs="Calibri"/>
           <w:b/>
@@ -403,6 +466,7 @@
     <w:p>
       <w:pPr>
         <w:pStyle w:val="Heading2"/>
+        <w:spacing w:line="240" w:lineRule="auto"/>
         <w:rPr>
           <w:rFonts w:ascii="Calibri" w:eastAsia="Calibri" w:hAnsi="Calibri" w:cs="Calibri"/>
           <w:b/>
@@ -428,6 +492,7 @@
     </w:p>
     <w:p>
       <w:pPr>
+        <w:spacing w:line="240" w:lineRule="auto"/>
         <w:rPr>
           <w:rFonts w:ascii="Calibri" w:eastAsia="Calibri" w:hAnsi="Calibri" w:cs="Calibri"/>
           <w:b/>
@@ -445,6 +510,7 @@
     </w:p>
     <w:p>
       <w:pPr>
+        <w:spacing w:line="240" w:lineRule="auto"/>
         <w:rPr>
           <w:rFonts w:ascii="Calibri" w:eastAsia="Calibri" w:hAnsi="Calibri" w:cs="Calibri"/>
           <w:sz w:val="20"/>
@@ -462,33 +528,7 @@
     </w:p>
     <w:p>
       <w:pPr>
-        <w:pStyle w:val="ListParagraph"/>
-        <w:numPr>
-          <w:ilvl w:val="0"/>
-          <w:numId w:val="10"/>
-        </w:numPr>
-        <w:spacing w:after="240"/>
-        <w:rPr>
-          <w:rFonts w:ascii="Calibri" w:eastAsia="Calibri" w:hAnsi="Calibri" w:cs="Calibri"/>
-        </w:rPr>
-      </w:pPr>
-      <w:r>
-        <w:rPr>
-          <w:rFonts w:ascii="Calibri" w:eastAsia="Calibri" w:hAnsi="Calibri" w:cs="Calibri"/>
-          <w:b/>
-          <w:bCs/>
-        </w:rPr>
-        <w:t>Relevant Coursework</w:t>
-      </w:r>
-      <w:r>
-        <w:rPr>
-          <w:rFonts w:ascii="Calibri" w:eastAsia="Calibri" w:hAnsi="Calibri" w:cs="Calibri"/>
-        </w:rPr>
-        <w:t>: Object-Oriented Programming, Database, Computer Environments, Unix/Linux, Web Application Development, Mobile App Development, Network Administration</w:t>
-      </w:r>
-    </w:p>
-    <w:p>
-      <w:pPr>
+        <w:spacing w:before="240" w:line="240" w:lineRule="auto"/>
         <w:rPr>
           <w:rFonts w:ascii="Calibri" w:eastAsia="Calibri" w:hAnsi="Calibri" w:cs="Calibri"/>
           <w:b/>
@@ -506,6 +546,7 @@
     </w:p>
     <w:p>
       <w:pPr>
+        <w:spacing w:line="240" w:lineRule="auto"/>
         <w:ind w:left="720" w:hanging="720"/>
         <w:rPr>
           <w:rFonts w:ascii="Calibri" w:eastAsia="Calibri" w:hAnsi="Calibri" w:cs="Calibri"/>
@@ -564,23 +605,25 @@
           <w:sz w:val="20"/>
           <w:szCs w:val="20"/>
         </w:rPr>
-        <w:t xml:space="preserve"> LaVoie | </w:t>
-      </w:r>
+        <w:t xml:space="preserve"> </w:t>
+      </w:r>
+      <w:proofErr w:type="spellStart"/>
       <w:r>
         <w:rPr>
           <w:rFonts w:ascii="Calibri" w:eastAsia="Calibri" w:hAnsi="Calibri" w:cs="Calibri"/>
           <w:sz w:val="20"/>
           <w:szCs w:val="20"/>
         </w:rPr>
-        <w:t>G</w:t>
-      </w:r>
+        <w:t>LaVoie</w:t>
+      </w:r>
+      <w:proofErr w:type="spellEnd"/>
       <w:r>
         <w:rPr>
           <w:rFonts w:ascii="Calibri" w:eastAsia="Calibri" w:hAnsi="Calibri" w:cs="Calibri"/>
           <w:sz w:val="20"/>
           <w:szCs w:val="20"/>
         </w:rPr>
-        <w:t xml:space="preserve">raduated </w:t>
+        <w:t>, Montreal Qc</w:t>
       </w:r>
       <w:r>
         <w:rPr>
@@ -588,7 +631,7 @@
           <w:sz w:val="20"/>
           <w:szCs w:val="20"/>
         </w:rPr>
-        <w:t xml:space="preserve">in June </w:t>
+        <w:t xml:space="preserve"> | </w:t>
       </w:r>
       <w:r>
         <w:rPr>
@@ -596,12 +639,37 @@
           <w:sz w:val="20"/>
           <w:szCs w:val="20"/>
         </w:rPr>
+        <w:t>G</w:t>
+      </w:r>
+      <w:r>
+        <w:rPr>
+          <w:rFonts w:ascii="Calibri" w:eastAsia="Calibri" w:hAnsi="Calibri" w:cs="Calibri"/>
+          <w:sz w:val="20"/>
+          <w:szCs w:val="20"/>
+        </w:rPr>
+        <w:t xml:space="preserve">raduated </w:t>
+      </w:r>
+      <w:r>
+        <w:rPr>
+          <w:rFonts w:ascii="Calibri" w:eastAsia="Calibri" w:hAnsi="Calibri" w:cs="Calibri"/>
+          <w:sz w:val="20"/>
+          <w:szCs w:val="20"/>
+        </w:rPr>
+        <w:t xml:space="preserve">in June </w:t>
+      </w:r>
+      <w:r>
+        <w:rPr>
+          <w:rFonts w:ascii="Calibri" w:eastAsia="Calibri" w:hAnsi="Calibri" w:cs="Calibri"/>
+          <w:sz w:val="20"/>
+          <w:szCs w:val="20"/>
+        </w:rPr>
         <w:t>2023</w:t>
       </w:r>
     </w:p>
     <w:p>
       <w:pPr>
         <w:pStyle w:val="Heading2"/>
+        <w:spacing w:line="240" w:lineRule="auto"/>
         <w:rPr>
           <w:rFonts w:ascii="Calibri" w:eastAsia="Calibri" w:hAnsi="Calibri" w:cs="Calibri"/>
           <w:b/>
@@ -627,23 +695,7 @@
     </w:p>
     <w:p>
       <w:pPr>
-        <w:rPr>
-          <w:rFonts w:ascii="Calibri" w:eastAsia="Calibri" w:hAnsi="Calibri" w:cs="Calibri"/>
-          <w:b/>
-          <w:bCs/>
-        </w:rPr>
-      </w:pPr>
-      <w:r>
-        <w:rPr>
-          <w:rFonts w:ascii="Calibri" w:eastAsia="Calibri" w:hAnsi="Calibri" w:cs="Calibri"/>
-          <w:b/>
-          <w:bCs/>
-        </w:rPr>
-        <w:t>Fitness Application</w:t>
-      </w:r>
-    </w:p>
-    <w:p>
-      <w:pPr>
+        <w:spacing w:line="240" w:lineRule="auto"/>
         <w:rPr>
           <w:rFonts w:ascii="Calibri" w:eastAsia="Calibri" w:hAnsi="Calibri" w:cs="Calibri"/>
         </w:rPr>
@@ -655,14 +707,30 @@
             <w:color w:val="1155CC"/>
             <w:u w:val="single"/>
           </w:rPr>
-          <w:t>https://github.com/Cy-EF0510/ApplicationDevelopment2Project</w:t>
+          <w:t>Fitness</w:t>
         </w:r>
       </w:hyperlink>
       <w:r>
         <w:rPr>
           <w:rFonts w:ascii="Calibri" w:eastAsia="Calibri" w:hAnsi="Calibri" w:cs="Calibri"/>
-        </w:rPr>
-        <w:t xml:space="preserve"> | Dart, Google Maps API</w:t>
+          <w:color w:val="1155CC"/>
+          <w:u w:val="single"/>
+        </w:rPr>
+        <w:t xml:space="preserve"> Application</w:t>
+      </w:r>
+      <w:r>
+        <w:rPr>
+          <w:rFonts w:ascii="Calibri" w:eastAsia="Calibri" w:hAnsi="Calibri" w:cs="Calibri"/>
+        </w:rPr>
+        <w:t xml:space="preserve"> | </w:t>
+      </w:r>
+      <w:r>
+        <w:rPr>
+          <w:rFonts w:ascii="Calibri" w:eastAsia="Calibri" w:hAnsi="Calibri" w:cs="Calibri"/>
+          <w:sz w:val="20"/>
+          <w:szCs w:val="20"/>
+        </w:rPr>
+        <w:t>Dart, Google Maps API</w:t>
       </w:r>
     </w:p>
     <w:p>
@@ -717,23 +785,6 @@
           <w:rFonts w:ascii="Calibri" w:eastAsia="Calibri" w:hAnsi="Calibri" w:cs="Calibri"/>
         </w:rPr>
         <w:t>Designed a user-friendly interface using Flutter widgets and multiple application screens</w:t>
-      </w:r>
-    </w:p>
-    <w:p>
-      <w:pPr>
-        <w:rPr>
-          <w:rFonts w:ascii="Calibri" w:eastAsia="Calibri" w:hAnsi="Calibri" w:cs="Calibri"/>
-          <w:b/>
-          <w:bCs/>
-        </w:rPr>
-      </w:pPr>
-      <w:r>
-        <w:rPr>
-          <w:rFonts w:ascii="Calibri" w:eastAsia="Calibri" w:hAnsi="Calibri" w:cs="Calibri"/>
-          <w:b/>
-          <w:bCs/>
-        </w:rPr>
-        <w:t>Venue Hall Reservation Web Application</w:t>
       </w:r>
     </w:p>
     <w:p>
@@ -749,18 +800,36 @@
             <w:color w:val="1155CC"/>
             <w:u w:val="single"/>
           </w:rPr>
-          <w:t>https://github.com/DPerrotta06/System-Dev-Project</w:t>
+          <w:t>Venu</w:t>
         </w:r>
       </w:hyperlink>
       <w:r>
         <w:rPr>
           <w:rFonts w:ascii="Calibri" w:eastAsia="Calibri" w:hAnsi="Calibri" w:cs="Calibri"/>
-        </w:rPr>
-        <w:t xml:space="preserve"> | PHP, MariaDB</w:t>
-      </w:r>
-      <w:r>
-        <w:rPr>
-          <w:rFonts w:ascii="Calibri" w:eastAsia="Calibri" w:hAnsi="Calibri" w:cs="Calibri"/>
+          <w:color w:val="1155CC"/>
+          <w:u w:val="single"/>
+        </w:rPr>
+        <w:t xml:space="preserve"> Hall Reservation Web Application</w:t>
+      </w:r>
+      <w:r>
+        <w:rPr>
+          <w:rFonts w:ascii="Calibri" w:eastAsia="Calibri" w:hAnsi="Calibri" w:cs="Calibri"/>
+        </w:rPr>
+        <w:t xml:space="preserve"> | </w:t>
+      </w:r>
+      <w:r>
+        <w:rPr>
+          <w:rFonts w:ascii="Calibri" w:eastAsia="Calibri" w:hAnsi="Calibri" w:cs="Calibri"/>
+          <w:sz w:val="20"/>
+          <w:szCs w:val="20"/>
+        </w:rPr>
+        <w:t>PHP, MariaDB</w:t>
+      </w:r>
+      <w:r>
+        <w:rPr>
+          <w:rFonts w:ascii="Calibri" w:eastAsia="Calibri" w:hAnsi="Calibri" w:cs="Calibri"/>
+          <w:sz w:val="20"/>
+          <w:szCs w:val="20"/>
         </w:rPr>
         <w:t>, Linux</w:t>
       </w:r>
@@ -881,7 +950,29 @@
           <w:b/>
           <w:bCs/>
         </w:rPr>
-        <w:t xml:space="preserve"> | Vanier College, February 2025</w:t>
+        <w:t xml:space="preserve"> </w:t>
+      </w:r>
+      <w:r>
+        <w:rPr>
+          <w:rFonts w:ascii="Calibri" w:eastAsia="Calibri" w:hAnsi="Calibri" w:cs="Calibri"/>
+        </w:rPr>
+        <w:t>|</w:t>
+      </w:r>
+      <w:r>
+        <w:rPr>
+          <w:rFonts w:ascii="Calibri" w:eastAsia="Calibri" w:hAnsi="Calibri" w:cs="Calibri"/>
+          <w:b/>
+          <w:bCs/>
+        </w:rPr>
+        <w:t xml:space="preserve"> </w:t>
+      </w:r>
+      <w:r>
+        <w:rPr>
+          <w:rFonts w:ascii="Calibri" w:eastAsia="Calibri" w:hAnsi="Calibri" w:cs="Calibri"/>
+          <w:sz w:val="20"/>
+          <w:szCs w:val="20"/>
+        </w:rPr>
+        <w:t>Vanier College, February 2025</w:t>
       </w:r>
     </w:p>
     <w:p>
@@ -945,6 +1036,7 @@
     <w:p>
       <w:pPr>
         <w:pStyle w:val="Heading2"/>
+        <w:spacing w:line="240" w:lineRule="auto"/>
         <w:rPr>
           <w:rFonts w:ascii="Calibri" w:eastAsia="Calibri" w:hAnsi="Calibri" w:cs="Calibri"/>
           <w:b/>
@@ -963,7 +1055,6 @@
           <w:sz w:val="24"/>
           <w:szCs w:val="24"/>
         </w:rPr>
-        <w:lastRenderedPageBreak/>
         <w:t>GENERAL SKILLS</w:t>
       </w:r>
     </w:p>
@@ -1093,13 +1184,6 @@
         </w:rPr>
         <w:t>, Working Under Pressure</w:t>
       </w:r>
-    </w:p>
-    <w:p>
-      <w:pPr>
-        <w:rPr>
-          <w:rFonts w:ascii="Calibri" w:eastAsia="Calibri" w:hAnsi="Calibri" w:cs="Calibri"/>
-        </w:rPr>
-      </w:pPr>
     </w:p>
     <w:p>
       <w:pPr>
@@ -1121,7 +1205,7 @@
 </file>
 
 <file path=word/endnotes.xml><?xml version="1.0" encoding="utf-8"?>
-<w:endnotes xmlns:wpc="http://schemas.microsoft.com/office/word/2010/wordprocessingCanvas" xmlns:cx="http://schemas.microsoft.com/office/drawing/2014/chartex" xmlns:cx1="http://schemas.microsoft.com/office/drawing/2015/9/8/chartex" xmlns:cx2="http://schemas.microsoft.com/office/drawing/2015/10/21/chartex" xmlns:cx3="http://schemas.microsoft.com/office/drawing/2016/5/9/chartex" xmlns:cx4="http://schemas.microsoft.com/office/drawing/2016/5/10/chartex" xmlns:cx5="http://schemas.microsoft.com/office/drawing/2016/5/11/chartex" xmlns:cx6="http://schemas.microsoft.com/office/drawing/2016/5/12/chartex" xmlns:cx7="http://schemas.microsoft.com/office/drawing/2016/5/13/chartex" xmlns:cx8="http://schemas.microsoft.com/office/drawing/2016/5/14/chartex" xmlns:mc="http://schemas.openxmlformats.org/markup-compatibility/2006" xmlns:aink="http://schemas.microsoft.com/office/drawing/2016/ink" xmlns:am3d="http://schemas.microsoft.com/office/drawing/2017/model3d" xmlns:o="urn:schemas-microsoft-com:office:office" xmlns:oel="http://schemas.microsoft.com/office/2019/extlst" xmlns:r="http://schemas.openxmlformats.org/officeDocument/2006/relationships" xmlns:m="http://schemas.openxmlformats.org/officeDocument/2006/math" xmlns:v="urn:schemas-microsoft-com:vml" xmlns:wp14="http://schemas.microsoft.com/office/word/2010/wordprocessingDrawing" xmlns:wp="http://schemas.openxmlformats.org/drawingml/2006/wordprocessingDrawing" xmlns:w10="urn:schemas-microsoft-com:office:word" xmlns:w="http://schemas.openxmlformats.org/wordprocessingml/2006/main" xmlns:w14="http://schemas.microsoft.com/office/word/2010/wordml" xmlns:w15="http://schemas.microsoft.com/office/word/2012/wordml" xmlns:w16cex="http://schemas.microsoft.com/office/word/2018/wordml/cex" xmlns:w16cid="http://schemas.microsoft.com/office/word/2016/wordml/cid" xmlns:w16="http://schemas.microsoft.com/office/word/2018/wordml" xmlns:w16du="http://schemas.microsoft.com/office/word/2023/wordml/word16du" xmlns:w16sdtdh="http://schemas.microsoft.com/office/word/2020/wordml/sdtdatahash" xmlns:w16sdtfl="http://schemas.microsoft.com/office/word/2024/wordml/sdtformatlock" xmlns:w16se="http://schemas.microsoft.com/office/word/2015/wordml/symex" xmlns:wpg="http://schemas.microsoft.com/office/word/2010/wordprocessingGroup" xmlns:wpi="http://schemas.microsoft.com/office/word/2010/wordprocessingInk" xmlns:wne="http://schemas.microsoft.com/office/word/2006/wordml" xmlns:wps="http://schemas.microsoft.com/office/word/2010/wordprocessingShape" mc:Ignorable="w14 w15 w16se w16cid w16 w16cex w16sdtdh w16sdtfl w16du wp14">
+<w:endnotes xmlns:wpc="http://schemas.microsoft.com/office/word/2010/wordprocessingCanvas" xmlns:cx="http://schemas.microsoft.com/office/drawing/2014/chartex" xmlns:cx1="http://schemas.microsoft.com/office/drawing/2015/9/8/chartex" xmlns:cx2="http://schemas.microsoft.com/office/drawing/2015/10/21/chartex" xmlns:cx3="http://schemas.microsoft.com/office/drawing/2016/5/9/chartex" xmlns:cx4="http://schemas.microsoft.com/office/drawing/2016/5/10/chartex" xmlns:cx5="http://schemas.microsoft.com/office/drawing/2016/5/11/chartex" xmlns:cx6="http://schemas.microsoft.com/office/drawing/2016/5/12/chartex" xmlns:cx7="http://schemas.microsoft.com/office/drawing/2016/5/13/chartex" xmlns:cx8="http://schemas.microsoft.com/office/drawing/2016/5/14/chartex" xmlns:mc="http://schemas.openxmlformats.org/markup-compatibility/2006" xmlns:aink="http://schemas.microsoft.com/office/drawing/2016/ink" xmlns:am3d="http://schemas.microsoft.com/office/drawing/2017/model3d" xmlns:o="urn:schemas-microsoft-com:office:office" xmlns:oel="http://schemas.microsoft.com/office/2019/extlst" xmlns:r="http://schemas.openxmlformats.org/officeDocument/2006/relationships" xmlns:m="http://schemas.openxmlformats.org/officeDocument/2006/math" xmlns:v="urn:schemas-microsoft-com:vml" xmlns:wp14="http://schemas.microsoft.com/office/word/2010/wordprocessingDrawing" xmlns:wp="http://schemas.openxmlformats.org/drawingml/2006/wordprocessingDrawing" xmlns:w10="urn:schemas-microsoft-com:office:word" xmlns:w="http://schemas.openxmlformats.org/wordprocessingml/2006/main" xmlns:w14="http://schemas.microsoft.com/office/word/2010/wordml" xmlns:w15="http://schemas.microsoft.com/office/word/2012/wordml" xmlns:w16cex="http://schemas.microsoft.com/office/word/2018/wordml/cex" xmlns:w16cid="http://schemas.microsoft.com/office/word/2016/wordml/cid" xmlns:w16="http://schemas.microsoft.com/office/word/2018/wordml" xmlns:w16sdtdh="http://schemas.microsoft.com/office/word/2020/wordml/sdtdatahash" xmlns:w16se="http://schemas.microsoft.com/office/word/2015/wordml/symex" xmlns:wpg="http://schemas.microsoft.com/office/word/2010/wordprocessingGroup" xmlns:wpi="http://schemas.microsoft.com/office/word/2010/wordprocessingInk" xmlns:wne="http://schemas.microsoft.com/office/word/2006/wordml" xmlns:wps="http://schemas.microsoft.com/office/word/2010/wordprocessingShape" mc:Ignorable="w14 w15 w16se w16cid w16 w16cex w16sdtdh wp14">
   <w:endnote w:type="separator" w:id="-1">
     <w:p>
       <w:pPr>
@@ -1146,7 +1230,7 @@
 </file>
 
 <file path=word/footnotes.xml><?xml version="1.0" encoding="utf-8"?>
-<w:footnotes xmlns:wpc="http://schemas.microsoft.com/office/word/2010/wordprocessingCanvas" xmlns:cx="http://schemas.microsoft.com/office/drawing/2014/chartex" xmlns:cx1="http://schemas.microsoft.com/office/drawing/2015/9/8/chartex" xmlns:cx2="http://schemas.microsoft.com/office/drawing/2015/10/21/chartex" xmlns:cx3="http://schemas.microsoft.com/office/drawing/2016/5/9/chartex" xmlns:cx4="http://schemas.microsoft.com/office/drawing/2016/5/10/chartex" xmlns:cx5="http://schemas.microsoft.com/office/drawing/2016/5/11/chartex" xmlns:cx6="http://schemas.microsoft.com/office/drawing/2016/5/12/chartex" xmlns:cx7="http://schemas.microsoft.com/office/drawing/2016/5/13/chartex" xmlns:cx8="http://schemas.microsoft.com/office/drawing/2016/5/14/chartex" xmlns:mc="http://schemas.openxmlformats.org/markup-compatibility/2006" xmlns:aink="http://schemas.microsoft.com/office/drawing/2016/ink" xmlns:am3d="http://schemas.microsoft.com/office/drawing/2017/model3d" xmlns:o="urn:schemas-microsoft-com:office:office" xmlns:oel="http://schemas.microsoft.com/office/2019/extlst" xmlns:r="http://schemas.openxmlformats.org/officeDocument/2006/relationships" xmlns:m="http://schemas.openxmlformats.org/officeDocument/2006/math" xmlns:v="urn:schemas-microsoft-com:vml" xmlns:wp14="http://schemas.microsoft.com/office/word/2010/wordprocessingDrawing" xmlns:wp="http://schemas.openxmlformats.org/drawingml/2006/wordprocessingDrawing" xmlns:w10="urn:schemas-microsoft-com:office:word" xmlns:w="http://schemas.openxmlformats.org/wordprocessingml/2006/main" xmlns:w14="http://schemas.microsoft.com/office/word/2010/wordml" xmlns:w15="http://schemas.microsoft.com/office/word/2012/wordml" xmlns:w16cex="http://schemas.microsoft.com/office/word/2018/wordml/cex" xmlns:w16cid="http://schemas.microsoft.com/office/word/2016/wordml/cid" xmlns:w16="http://schemas.microsoft.com/office/word/2018/wordml" xmlns:w16du="http://schemas.microsoft.com/office/word/2023/wordml/word16du" xmlns:w16sdtdh="http://schemas.microsoft.com/office/word/2020/wordml/sdtdatahash" xmlns:w16sdtfl="http://schemas.microsoft.com/office/word/2024/wordml/sdtformatlock" xmlns:w16se="http://schemas.microsoft.com/office/word/2015/wordml/symex" xmlns:wpg="http://schemas.microsoft.com/office/word/2010/wordprocessingGroup" xmlns:wpi="http://schemas.microsoft.com/office/word/2010/wordprocessingInk" xmlns:wne="http://schemas.microsoft.com/office/word/2006/wordml" xmlns:wps="http://schemas.microsoft.com/office/word/2010/wordprocessingShape" mc:Ignorable="w14 w15 w16se w16cid w16 w16cex w16sdtdh w16sdtfl w16du wp14">
+<w:footnotes xmlns:wpc="http://schemas.microsoft.com/office/word/2010/wordprocessingCanvas" xmlns:cx="http://schemas.microsoft.com/office/drawing/2014/chartex" xmlns:cx1="http://schemas.microsoft.com/office/drawing/2015/9/8/chartex" xmlns:cx2="http://schemas.microsoft.com/office/drawing/2015/10/21/chartex" xmlns:cx3="http://schemas.microsoft.com/office/drawing/2016/5/9/chartex" xmlns:cx4="http://schemas.microsoft.com/office/drawing/2016/5/10/chartex" xmlns:cx5="http://schemas.microsoft.com/office/drawing/2016/5/11/chartex" xmlns:cx6="http://schemas.microsoft.com/office/drawing/2016/5/12/chartex" xmlns:cx7="http://schemas.microsoft.com/office/drawing/2016/5/13/chartex" xmlns:cx8="http://schemas.microsoft.com/office/drawing/2016/5/14/chartex" xmlns:mc="http://schemas.openxmlformats.org/markup-compatibility/2006" xmlns:aink="http://schemas.microsoft.com/office/drawing/2016/ink" xmlns:am3d="http://schemas.microsoft.com/office/drawing/2017/model3d" xmlns:o="urn:schemas-microsoft-com:office:office" xmlns:oel="http://schemas.microsoft.com/office/2019/extlst" xmlns:r="http://schemas.openxmlformats.org/officeDocument/2006/relationships" xmlns:m="http://schemas.openxmlformats.org/officeDocument/2006/math" xmlns:v="urn:schemas-microsoft-com:vml" xmlns:wp14="http://schemas.microsoft.com/office/word/2010/wordprocessingDrawing" xmlns:wp="http://schemas.openxmlformats.org/drawingml/2006/wordprocessingDrawing" xmlns:w10="urn:schemas-microsoft-com:office:word" xmlns:w="http://schemas.openxmlformats.org/wordprocessingml/2006/main" xmlns:w14="http://schemas.microsoft.com/office/word/2010/wordml" xmlns:w15="http://schemas.microsoft.com/office/word/2012/wordml" xmlns:w16cex="http://schemas.microsoft.com/office/word/2018/wordml/cex" xmlns:w16cid="http://schemas.microsoft.com/office/word/2016/wordml/cid" xmlns:w16="http://schemas.microsoft.com/office/word/2018/wordml" xmlns:w16sdtdh="http://schemas.microsoft.com/office/word/2020/wordml/sdtdatahash" xmlns:w16se="http://schemas.microsoft.com/office/word/2015/wordml/symex" xmlns:wpg="http://schemas.microsoft.com/office/word/2010/wordprocessingGroup" xmlns:wpi="http://schemas.microsoft.com/office/word/2010/wordprocessingInk" xmlns:wne="http://schemas.microsoft.com/office/word/2006/wordml" xmlns:wps="http://schemas.microsoft.com/office/word/2010/wordprocessingShape" mc:Ignorable="w14 w15 w16se w16cid w16 w16cex w16sdtdh wp14">
   <w:footnote w:type="separator" w:id="-1">
     <w:p>
       <w:pPr>
@@ -1171,85 +1255,16 @@
 </file>
 
 <file path=word/header1.xml><?xml version="1.0" encoding="utf-8"?>
-<w:hdr xmlns:wpc="http://schemas.microsoft.com/office/word/2010/wordprocessingCanvas" xmlns:cx="http://schemas.microsoft.com/office/drawing/2014/chartex" xmlns:cx1="http://schemas.microsoft.com/office/drawing/2015/9/8/chartex" xmlns:cx2="http://schemas.microsoft.com/office/drawing/2015/10/21/chartex" xmlns:cx3="http://schemas.microsoft.com/office/drawing/2016/5/9/chartex" xmlns:cx4="http://schemas.microsoft.com/office/drawing/2016/5/10/chartex" xmlns:cx5="http://schemas.microsoft.com/office/drawing/2016/5/11/chartex" xmlns:cx6="http://schemas.microsoft.com/office/drawing/2016/5/12/chartex" xmlns:cx7="http://schemas.microsoft.com/office/drawing/2016/5/13/chartex" xmlns:cx8="http://schemas.microsoft.com/office/drawing/2016/5/14/chartex" xmlns:mc="http://schemas.openxmlformats.org/markup-compatibility/2006" xmlns:aink="http://schemas.microsoft.com/office/drawing/2016/ink" xmlns:am3d="http://schemas.microsoft.com/office/drawing/2017/model3d" xmlns:o="urn:schemas-microsoft-com:office:office" xmlns:oel="http://schemas.microsoft.com/office/2019/extlst" xmlns:r="http://schemas.openxmlformats.org/officeDocument/2006/relationships" xmlns:m="http://schemas.openxmlformats.org/officeDocument/2006/math" xmlns:v="urn:schemas-microsoft-com:vml" xmlns:wp14="http://schemas.microsoft.com/office/word/2010/wordprocessingDrawing" xmlns:wp="http://schemas.openxmlformats.org/drawingml/2006/wordprocessingDrawing" xmlns:w10="urn:schemas-microsoft-com:office:word" xmlns:w="http://schemas.openxmlformats.org/wordprocessingml/2006/main" xmlns:w14="http://schemas.microsoft.com/office/word/2010/wordml" xmlns:w15="http://schemas.microsoft.com/office/word/2012/wordml" xmlns:w16cex="http://schemas.microsoft.com/office/word/2018/wordml/cex" xmlns:w16cid="http://schemas.microsoft.com/office/word/2016/wordml/cid" xmlns:w16="http://schemas.microsoft.com/office/word/2018/wordml" xmlns:w16du="http://schemas.microsoft.com/office/word/2023/wordml/word16du" xmlns:w16sdtdh="http://schemas.microsoft.com/office/word/2020/wordml/sdtdatahash" xmlns:w16sdtfl="http://schemas.microsoft.com/office/word/2024/wordml/sdtformatlock" xmlns:w16se="http://schemas.microsoft.com/office/word/2015/wordml/symex" xmlns:wpg="http://schemas.microsoft.com/office/word/2010/wordprocessingGroup" xmlns:wpi="http://schemas.microsoft.com/office/word/2010/wordprocessingInk" xmlns:wne="http://schemas.microsoft.com/office/word/2006/wordml" xmlns:wps="http://schemas.microsoft.com/office/word/2010/wordprocessingShape" mc:Ignorable="w14 w15 w16se w16cid w16 w16cex w16sdtdh w16sdtfl w16du wp14">
+<w:hdr xmlns:wpc="http://schemas.microsoft.com/office/word/2010/wordprocessingCanvas" xmlns:cx="http://schemas.microsoft.com/office/drawing/2014/chartex" xmlns:cx1="http://schemas.microsoft.com/office/drawing/2015/9/8/chartex" xmlns:cx2="http://schemas.microsoft.com/office/drawing/2015/10/21/chartex" xmlns:cx3="http://schemas.microsoft.com/office/drawing/2016/5/9/chartex" xmlns:cx4="http://schemas.microsoft.com/office/drawing/2016/5/10/chartex" xmlns:cx5="http://schemas.microsoft.com/office/drawing/2016/5/11/chartex" xmlns:cx6="http://schemas.microsoft.com/office/drawing/2016/5/12/chartex" xmlns:cx7="http://schemas.microsoft.com/office/drawing/2016/5/13/chartex" xmlns:cx8="http://schemas.microsoft.com/office/drawing/2016/5/14/chartex" xmlns:mc="http://schemas.openxmlformats.org/markup-compatibility/2006" xmlns:aink="http://schemas.microsoft.com/office/drawing/2016/ink" xmlns:am3d="http://schemas.microsoft.com/office/drawing/2017/model3d" xmlns:o="urn:schemas-microsoft-com:office:office" xmlns:oel="http://schemas.microsoft.com/office/2019/extlst" xmlns:r="http://schemas.openxmlformats.org/officeDocument/2006/relationships" xmlns:m="http://schemas.openxmlformats.org/officeDocument/2006/math" xmlns:v="urn:schemas-microsoft-com:vml" xmlns:wp14="http://schemas.microsoft.com/office/word/2010/wordprocessingDrawing" xmlns:wp="http://schemas.openxmlformats.org/drawingml/2006/wordprocessingDrawing" xmlns:w10="urn:schemas-microsoft-com:office:word" xmlns:w="http://schemas.openxmlformats.org/wordprocessingml/2006/main" xmlns:w14="http://schemas.microsoft.com/office/word/2010/wordml" xmlns:w15="http://schemas.microsoft.com/office/word/2012/wordml" xmlns:w16cex="http://schemas.microsoft.com/office/word/2018/wordml/cex" xmlns:w16cid="http://schemas.microsoft.com/office/word/2016/wordml/cid" xmlns:w16="http://schemas.microsoft.com/office/word/2018/wordml" xmlns:w16sdtdh="http://schemas.microsoft.com/office/word/2020/wordml/sdtdatahash" xmlns:w16se="http://schemas.microsoft.com/office/word/2015/wordml/symex" xmlns:wpg="http://schemas.microsoft.com/office/word/2010/wordprocessingGroup" xmlns:wpi="http://schemas.microsoft.com/office/word/2010/wordprocessingInk" xmlns:wne="http://schemas.microsoft.com/office/word/2006/wordml" xmlns:wps="http://schemas.microsoft.com/office/word/2010/wordprocessingShape" mc:Ignorable="w14 w15 w16se w16cid w16 w16cex w16sdtdh wp14">
   <w:p>
     <w:pPr>
       <w:pStyle w:val="Header"/>
-      <w:tabs>
-        <w:tab w:val="clear" w:pos="4680"/>
-        <w:tab w:val="clear" w:pos="9360"/>
-      </w:tabs>
-      <w:jc w:val="right"/>
-      <w:rPr>
+      <w:rPr>
+        <w:rFonts w:asciiTheme="majorHAnsi" w:hAnsiTheme="majorHAnsi" w:cstheme="majorHAnsi"/>
         <w:sz w:val="24"/>
         <w:szCs w:val="24"/>
-        <w:lang w:val="en-CA"/>
       </w:rPr>
     </w:pPr>
-    <w:r>
-      <w:rPr>
-        <w:sz w:val="24"/>
-        <w:szCs w:val="24"/>
-      </w:rPr>
-      <w:t>Cyril Efren Fabro</w:t>
-    </w:r>
-    <w:r>
-      <w:rPr>
-        <w:sz w:val="24"/>
-        <w:szCs w:val="24"/>
-      </w:rPr>
-      <w:t>,</w:t>
-    </w:r>
-    <w:r>
-      <w:rPr>
-        <w:sz w:val="24"/>
-        <w:szCs w:val="24"/>
-      </w:rPr>
-      <w:t xml:space="preserve"> Page </w:t>
-    </w:r>
-    <w:r>
-      <w:rPr>
-        <w:sz w:val="24"/>
-        <w:szCs w:val="24"/>
-      </w:rPr>
-      <w:fldChar w:fldCharType="begin"/>
-    </w:r>
-    <w:r>
-      <w:rPr>
-        <w:sz w:val="24"/>
-        <w:szCs w:val="24"/>
-      </w:rPr>
-      <w:instrText>PAGE   \* MERGEFORMAT</w:instrText>
-    </w:r>
-    <w:r>
-      <w:rPr>
-        <w:sz w:val="24"/>
-        <w:szCs w:val="24"/>
-      </w:rPr>
-      <w:fldChar w:fldCharType="separate"/>
-    </w:r>
-    <w:r>
-      <w:rPr>
-        <w:sz w:val="24"/>
-        <w:szCs w:val="24"/>
-      </w:rPr>
-      <w:t>2</w:t>
-    </w:r>
-    <w:r>
-      <w:rPr>
-        <w:sz w:val="24"/>
-        <w:szCs w:val="24"/>
-      </w:rPr>
-      <w:fldChar w:fldCharType="end"/>
-    </w:r>
-    <w:r>
-      <w:rPr>
-        <w:sz w:val="24"/>
-        <w:szCs w:val="24"/>
-        <w:lang w:val="en-CA"/>
-      </w:rPr>
-      <w:t>/2</w:t>
-    </w:r>
   </w:p>
   <w:p>
     <w:pPr>
@@ -1260,7 +1275,7 @@
 </file>
 
 <file path=word/numbering.xml><?xml version="1.0" encoding="utf-8"?>
-<w:numbering xmlns:wpc="http://schemas.microsoft.com/office/word/2010/wordprocessingCanvas" xmlns:cx="http://schemas.microsoft.com/office/drawing/2014/chartex" xmlns:cx1="http://schemas.microsoft.com/office/drawing/2015/9/8/chartex" xmlns:cx2="http://schemas.microsoft.com/office/drawing/2015/10/21/chartex" xmlns:cx3="http://schemas.microsoft.com/office/drawing/2016/5/9/chartex" xmlns:cx4="http://schemas.microsoft.com/office/drawing/2016/5/10/chartex" xmlns:cx5="http://schemas.microsoft.com/office/drawing/2016/5/11/chartex" xmlns:cx6="http://schemas.microsoft.com/office/drawing/2016/5/12/chartex" xmlns:cx7="http://schemas.microsoft.com/office/drawing/2016/5/13/chartex" xmlns:cx8="http://schemas.microsoft.com/office/drawing/2016/5/14/chartex" xmlns:mc="http://schemas.openxmlformats.org/markup-compatibility/2006" xmlns:aink="http://schemas.microsoft.com/office/drawing/2016/ink" xmlns:am3d="http://schemas.microsoft.com/office/drawing/2017/model3d" xmlns:o="urn:schemas-microsoft-com:office:office" xmlns:oel="http://schemas.microsoft.com/office/2019/extlst" xmlns:r="http://schemas.openxmlformats.org/officeDocument/2006/relationships" xmlns:m="http://schemas.openxmlformats.org/officeDocument/2006/math" xmlns:v="urn:schemas-microsoft-com:vml" xmlns:wp14="http://schemas.microsoft.com/office/word/2010/wordprocessingDrawing" xmlns:wp="http://schemas.openxmlformats.org/drawingml/2006/wordprocessingDrawing" xmlns:w10="urn:schemas-microsoft-com:office:word" xmlns:w="http://schemas.openxmlformats.org/wordprocessingml/2006/main" xmlns:w14="http://schemas.microsoft.com/office/word/2010/wordml" xmlns:w15="http://schemas.microsoft.com/office/word/2012/wordml" xmlns:w16cex="http://schemas.microsoft.com/office/word/2018/wordml/cex" xmlns:w16cid="http://schemas.microsoft.com/office/word/2016/wordml/cid" xmlns:w16="http://schemas.microsoft.com/office/word/2018/wordml" xmlns:w16du="http://schemas.microsoft.com/office/word/2023/wordml/word16du" xmlns:w16sdtdh="http://schemas.microsoft.com/office/word/2020/wordml/sdtdatahash" xmlns:w16sdtfl="http://schemas.microsoft.com/office/word/2024/wordml/sdtformatlock" xmlns:w16se="http://schemas.microsoft.com/office/word/2015/wordml/symex" xmlns:wpg="http://schemas.microsoft.com/office/word/2010/wordprocessingGroup" xmlns:wpi="http://schemas.microsoft.com/office/word/2010/wordprocessingInk" xmlns:wne="http://schemas.microsoft.com/office/word/2006/wordml" xmlns:wps="http://schemas.microsoft.com/office/word/2010/wordprocessingShape" mc:Ignorable="w14 w15 w16se w16cid w16 w16cex w16sdtdh w16sdtfl w16du wp14">
+<w:numbering xmlns:wpc="http://schemas.microsoft.com/office/word/2010/wordprocessingCanvas" xmlns:cx="http://schemas.microsoft.com/office/drawing/2014/chartex" xmlns:cx1="http://schemas.microsoft.com/office/drawing/2015/9/8/chartex" xmlns:cx2="http://schemas.microsoft.com/office/drawing/2015/10/21/chartex" xmlns:cx3="http://schemas.microsoft.com/office/drawing/2016/5/9/chartex" xmlns:cx4="http://schemas.microsoft.com/office/drawing/2016/5/10/chartex" xmlns:cx5="http://schemas.microsoft.com/office/drawing/2016/5/11/chartex" xmlns:cx6="http://schemas.microsoft.com/office/drawing/2016/5/12/chartex" xmlns:cx7="http://schemas.microsoft.com/office/drawing/2016/5/13/chartex" xmlns:cx8="http://schemas.microsoft.com/office/drawing/2016/5/14/chartex" xmlns:mc="http://schemas.openxmlformats.org/markup-compatibility/2006" xmlns:aink="http://schemas.microsoft.com/office/drawing/2016/ink" xmlns:am3d="http://schemas.microsoft.com/office/drawing/2017/model3d" xmlns:o="urn:schemas-microsoft-com:office:office" xmlns:oel="http://schemas.microsoft.com/office/2019/extlst" xmlns:r="http://schemas.openxmlformats.org/officeDocument/2006/relationships" xmlns:m="http://schemas.openxmlformats.org/officeDocument/2006/math" xmlns:v="urn:schemas-microsoft-com:vml" xmlns:wp14="http://schemas.microsoft.com/office/word/2010/wordprocessingDrawing" xmlns:wp="http://schemas.openxmlformats.org/drawingml/2006/wordprocessingDrawing" xmlns:w10="urn:schemas-microsoft-com:office:word" xmlns:w="http://schemas.openxmlformats.org/wordprocessingml/2006/main" xmlns:w14="http://schemas.microsoft.com/office/word/2010/wordml" xmlns:w15="http://schemas.microsoft.com/office/word/2012/wordml" xmlns:w16cex="http://schemas.microsoft.com/office/word/2018/wordml/cex" xmlns:w16cid="http://schemas.microsoft.com/office/word/2016/wordml/cid" xmlns:w16="http://schemas.microsoft.com/office/word/2018/wordml" xmlns:w16sdtdh="http://schemas.microsoft.com/office/word/2020/wordml/sdtdatahash" xmlns:w16se="http://schemas.microsoft.com/office/word/2015/wordml/symex" xmlns:wpg="http://schemas.microsoft.com/office/word/2010/wordprocessingGroup" xmlns:wpi="http://schemas.microsoft.com/office/word/2010/wordprocessingInk" xmlns:wne="http://schemas.microsoft.com/office/word/2006/wordml" xmlns:wps="http://schemas.microsoft.com/office/word/2010/wordprocessingShape" mc:Ignorable="w14 w15 w16se w16cid w16 w16cex w16sdtdh wp14">
   <w:abstractNum w:abstractNumId="0" w15:restartNumberingAfterBreak="0">
     <w:nsid w:val="0AA34895"/>
     <w:multiLevelType w:val="multilevel"/>
@@ -2425,7 +2440,7 @@
 </file>
 
 <file path=word/styles.xml><?xml version="1.0" encoding="utf-8"?>
-<w:styles xmlns:mc="http://schemas.openxmlformats.org/markup-compatibility/2006" xmlns:r="http://schemas.openxmlformats.org/officeDocument/2006/relationships" xmlns:w="http://schemas.openxmlformats.org/wordprocessingml/2006/main" xmlns:w14="http://schemas.microsoft.com/office/word/2010/wordml" xmlns:w15="http://schemas.microsoft.com/office/word/2012/wordml" xmlns:w16cex="http://schemas.microsoft.com/office/word/2018/wordml/cex" xmlns:w16cid="http://schemas.microsoft.com/office/word/2016/wordml/cid" xmlns:w16="http://schemas.microsoft.com/office/word/2018/wordml" xmlns:w16du="http://schemas.microsoft.com/office/word/2023/wordml/word16du" xmlns:w16sdtdh="http://schemas.microsoft.com/office/word/2020/wordml/sdtdatahash" xmlns:w16sdtfl="http://schemas.microsoft.com/office/word/2024/wordml/sdtformatlock" xmlns:w16se="http://schemas.microsoft.com/office/word/2015/wordml/symex" mc:Ignorable="w14 w15 w16se w16cid w16 w16cex w16sdtdh w16sdtfl w16du">
+<w:styles xmlns:mc="http://schemas.openxmlformats.org/markup-compatibility/2006" xmlns:r="http://schemas.openxmlformats.org/officeDocument/2006/relationships" xmlns:w="http://schemas.openxmlformats.org/wordprocessingml/2006/main" xmlns:w14="http://schemas.microsoft.com/office/word/2010/wordml" xmlns:w15="http://schemas.microsoft.com/office/word/2012/wordml" xmlns:w16cex="http://schemas.microsoft.com/office/word/2018/wordml/cex" xmlns:w16cid="http://schemas.microsoft.com/office/word/2016/wordml/cid" xmlns:w16="http://schemas.microsoft.com/office/word/2018/wordml" xmlns:w16sdtdh="http://schemas.microsoft.com/office/word/2020/wordml/sdtdatahash" xmlns:w16se="http://schemas.microsoft.com/office/word/2015/wordml/symex" mc:Ignorable="w14 w15 w16se w16cid w16 w16cex w16sdtdh">
   <w:docDefaults>
     <w:rPrDefault>
       <w:rPr>

</xml_diff>

<commit_message>
Add IoT wireless technology presentation materials
Add the RP2 presentation and supporting device images, update resume and Game Programming II assignment files, and remove a temporary Word lock file.
</commit_message>
<xml_diff>
--- a/Resume/Cyril_Efren_Fabro_Resume.docx
+++ b/Resume/Cyril_Efren_Fabro_Resume.docx
@@ -1,6 +1,6 @@
 
 <file path=word/document.xml><?xml version="1.0" encoding="utf-8"?>
-<w:document xmlns:wpc="http://schemas.microsoft.com/office/word/2010/wordprocessingCanvas" xmlns:cx="http://schemas.microsoft.com/office/drawing/2014/chartex" xmlns:cx1="http://schemas.microsoft.com/office/drawing/2015/9/8/chartex" xmlns:cx2="http://schemas.microsoft.com/office/drawing/2015/10/21/chartex" xmlns:cx3="http://schemas.microsoft.com/office/drawing/2016/5/9/chartex" xmlns:cx4="http://schemas.microsoft.com/office/drawing/2016/5/10/chartex" xmlns:cx5="http://schemas.microsoft.com/office/drawing/2016/5/11/chartex" xmlns:cx6="http://schemas.microsoft.com/office/drawing/2016/5/12/chartex" xmlns:cx7="http://schemas.microsoft.com/office/drawing/2016/5/13/chartex" xmlns:cx8="http://schemas.microsoft.com/office/drawing/2016/5/14/chartex" xmlns:mc="http://schemas.openxmlformats.org/markup-compatibility/2006" xmlns:aink="http://schemas.microsoft.com/office/drawing/2016/ink" xmlns:am3d="http://schemas.microsoft.com/office/drawing/2017/model3d" xmlns:o="urn:schemas-microsoft-com:office:office" xmlns:oel="http://schemas.microsoft.com/office/2019/extlst" xmlns:r="http://schemas.openxmlformats.org/officeDocument/2006/relationships" xmlns:m="http://schemas.openxmlformats.org/officeDocument/2006/math" xmlns:v="urn:schemas-microsoft-com:vml" xmlns:wp14="http://schemas.microsoft.com/office/word/2010/wordprocessingDrawing" xmlns:wp="http://schemas.openxmlformats.org/drawingml/2006/wordprocessingDrawing" xmlns:w10="urn:schemas-microsoft-com:office:word" xmlns:w="http://schemas.openxmlformats.org/wordprocessingml/2006/main" xmlns:w14="http://schemas.microsoft.com/office/word/2010/wordml" xmlns:w15="http://schemas.microsoft.com/office/word/2012/wordml" xmlns:w16cex="http://schemas.microsoft.com/office/word/2018/wordml/cex" xmlns:w16cid="http://schemas.microsoft.com/office/word/2016/wordml/cid" xmlns:w16="http://schemas.microsoft.com/office/word/2018/wordml" xmlns:w16sdtdh="http://schemas.microsoft.com/office/word/2020/wordml/sdtdatahash" xmlns:w16se="http://schemas.microsoft.com/office/word/2015/wordml/symex" xmlns:wpg="http://schemas.microsoft.com/office/word/2010/wordprocessingGroup" xmlns:wpi="http://schemas.microsoft.com/office/word/2010/wordprocessingInk" xmlns:wne="http://schemas.microsoft.com/office/word/2006/wordml" xmlns:wps="http://schemas.microsoft.com/office/word/2010/wordprocessingShape" mc:Ignorable="w14 w15 w16se w16cid w16 w16cex w16sdtdh wp14">
+<w:document xmlns:wpc="http://schemas.microsoft.com/office/word/2010/wordprocessingCanvas" xmlns:cx="http://schemas.microsoft.com/office/drawing/2014/chartex" xmlns:cx1="http://schemas.microsoft.com/office/drawing/2015/9/8/chartex" xmlns:cx2="http://schemas.microsoft.com/office/drawing/2015/10/21/chartex" xmlns:cx3="http://schemas.microsoft.com/office/drawing/2016/5/9/chartex" xmlns:cx4="http://schemas.microsoft.com/office/drawing/2016/5/10/chartex" xmlns:cx5="http://schemas.microsoft.com/office/drawing/2016/5/11/chartex" xmlns:cx6="http://schemas.microsoft.com/office/drawing/2016/5/12/chartex" xmlns:cx7="http://schemas.microsoft.com/office/drawing/2016/5/13/chartex" xmlns:cx8="http://schemas.microsoft.com/office/drawing/2016/5/14/chartex" xmlns:mc="http://schemas.openxmlformats.org/markup-compatibility/2006" xmlns:aink="http://schemas.microsoft.com/office/drawing/2016/ink" xmlns:am3d="http://schemas.microsoft.com/office/drawing/2017/model3d" xmlns:o="urn:schemas-microsoft-com:office:office" xmlns:oel="http://schemas.microsoft.com/office/2019/extlst" xmlns:r="http://schemas.openxmlformats.org/officeDocument/2006/relationships" xmlns:m="http://schemas.openxmlformats.org/officeDocument/2006/math" xmlns:v="urn:schemas-microsoft-com:vml" xmlns:wp14="http://schemas.microsoft.com/office/word/2010/wordprocessingDrawing" xmlns:wp="http://schemas.openxmlformats.org/drawingml/2006/wordprocessingDrawing" xmlns:w10="urn:schemas-microsoft-com:office:word" xmlns:w="http://schemas.openxmlformats.org/wordprocessingml/2006/main" xmlns:w14="http://schemas.microsoft.com/office/word/2010/wordml" xmlns:w15="http://schemas.microsoft.com/office/word/2012/wordml" xmlns:w16cex="http://schemas.microsoft.com/office/word/2018/wordml/cex" xmlns:w16cid="http://schemas.microsoft.com/office/word/2016/wordml/cid" xmlns:w16="http://schemas.microsoft.com/office/word/2018/wordml" xmlns:w16du="http://schemas.microsoft.com/office/word/2023/wordml/word16du" xmlns:w16sdtdh="http://schemas.microsoft.com/office/word/2020/wordml/sdtdatahash" xmlns:w16sdtfl="http://schemas.microsoft.com/office/word/2024/wordml/sdtformatlock" xmlns:w16se="http://schemas.microsoft.com/office/word/2015/wordml/symex" xmlns:wpg="http://schemas.microsoft.com/office/word/2010/wordprocessingGroup" xmlns:wpi="http://schemas.microsoft.com/office/word/2010/wordprocessingInk" xmlns:wne="http://schemas.microsoft.com/office/word/2006/wordml" xmlns:wps="http://schemas.microsoft.com/office/word/2010/wordprocessingShape" mc:Ignorable="w14 w15 w16se w16cid w16 w16cex w16sdtdh w16sdtfl w16du wp14">
   <w:body>
     <w:p>
       <w:pPr>
@@ -43,19 +43,7 @@
           <w:rPr>
             <w:rFonts w:ascii="Calibri" w:eastAsia="Calibri" w:hAnsi="Calibri" w:cs="Calibri"/>
           </w:rPr>
-          <w:t>efrencyril@</w:t>
-        </w:r>
-        <w:r>
-          <w:rPr>
-            <w:rFonts w:ascii="Calibri" w:eastAsia="Calibri" w:hAnsi="Calibri" w:cs="Calibri"/>
-          </w:rPr>
-          <w:t>g</w:t>
-        </w:r>
-        <w:r>
-          <w:rPr>
-            <w:rFonts w:ascii="Calibri" w:eastAsia="Calibri" w:hAnsi="Calibri" w:cs="Calibri"/>
-          </w:rPr>
-          <w:t>mail.com</w:t>
+          <w:t>efrencyril@gmail.com</w:t>
         </w:r>
       </w:hyperlink>
     </w:p>
@@ -73,39 +61,7 @@
             <w:color w:val="1155CC"/>
             <w:u w:val="single"/>
           </w:rPr>
-          <w:t>G</w:t>
-        </w:r>
-        <w:r>
-          <w:rPr>
-            <w:rFonts w:asciiTheme="majorHAnsi" w:hAnsiTheme="majorHAnsi" w:cstheme="majorHAnsi"/>
-            <w:color w:val="1155CC"/>
-            <w:u w:val="single"/>
-          </w:rPr>
-          <w:t>i</w:t>
-        </w:r>
-        <w:r>
-          <w:rPr>
-            <w:rFonts w:asciiTheme="majorHAnsi" w:hAnsiTheme="majorHAnsi" w:cstheme="majorHAnsi"/>
-            <w:color w:val="1155CC"/>
-            <w:u w:val="single"/>
-          </w:rPr>
-          <w:t>t</w:t>
-        </w:r>
-        <w:r>
-          <w:rPr>
-            <w:rFonts w:asciiTheme="majorHAnsi" w:hAnsiTheme="majorHAnsi" w:cstheme="majorHAnsi"/>
-            <w:color w:val="1155CC"/>
-            <w:u w:val="single"/>
-          </w:rPr>
-          <w:t>H</w:t>
-        </w:r>
-        <w:r>
-          <w:rPr>
-            <w:rFonts w:asciiTheme="majorHAnsi" w:hAnsiTheme="majorHAnsi" w:cstheme="majorHAnsi"/>
-            <w:color w:val="1155CC"/>
-            <w:u w:val="single"/>
-          </w:rPr>
-          <w:t>ub</w:t>
+          <w:t>GitHub</w:t>
         </w:r>
       </w:hyperlink>
       <w:r>
@@ -121,23 +77,7 @@
             <w:color w:val="1155CC"/>
             <w:u w:val="single"/>
           </w:rPr>
-          <w:t>Link</w:t>
-        </w:r>
-        <w:r>
-          <w:rPr>
-            <w:rFonts w:asciiTheme="majorHAnsi" w:hAnsiTheme="majorHAnsi" w:cstheme="majorHAnsi"/>
-            <w:color w:val="1155CC"/>
-            <w:u w:val="single"/>
-          </w:rPr>
-          <w:t>e</w:t>
-        </w:r>
-        <w:r>
-          <w:rPr>
-            <w:rFonts w:asciiTheme="majorHAnsi" w:hAnsiTheme="majorHAnsi" w:cstheme="majorHAnsi"/>
-            <w:color w:val="1155CC"/>
-            <w:u w:val="single"/>
-          </w:rPr>
-          <w:t>dIn</w:t>
+          <w:t>LinkedIn</w:t>
         </w:r>
       </w:hyperlink>
     </w:p>
@@ -454,6 +394,37 @@
           <w:b/>
           <w:bCs/>
         </w:rPr>
+        <w:t>Operating System</w:t>
+      </w:r>
+      <w:r>
+        <w:rPr>
+          <w:rFonts w:ascii="Times New Roman" w:eastAsia="Times New Roman" w:hAnsi="Times New Roman" w:cs="Times New Roman"/>
+        </w:rPr>
+        <w:t>:</w:t>
+      </w:r>
+      <w:r>
+        <w:rPr>
+          <w:rFonts w:ascii="Times New Roman" w:eastAsia="Times New Roman" w:hAnsi="Times New Roman" w:cs="Times New Roman"/>
+        </w:rPr>
+        <w:t xml:space="preserve"> Windows, Linux</w:t>
+      </w:r>
+    </w:p>
+    <w:p>
+      <w:pPr>
+        <w:numPr>
+          <w:ilvl w:val="0"/>
+          <w:numId w:val="1"/>
+        </w:numPr>
+        <w:rPr>
+          <w:rFonts w:ascii="Times New Roman" w:eastAsia="Times New Roman" w:hAnsi="Times New Roman" w:cs="Times New Roman"/>
+        </w:rPr>
+      </w:pPr>
+      <w:r>
+        <w:rPr>
+          <w:rFonts w:ascii="Calibri" w:eastAsia="Calibri" w:hAnsi="Calibri" w:cs="Calibri"/>
+          <w:b/>
+          <w:bCs/>
+        </w:rPr>
         <w:t>Other:</w:t>
       </w:r>
       <w:r>
@@ -605,18 +576,8 @@
           <w:sz w:val="20"/>
           <w:szCs w:val="20"/>
         </w:rPr>
-        <w:t xml:space="preserve"> </w:t>
-      </w:r>
-      <w:proofErr w:type="spellStart"/>
-      <w:r>
-        <w:rPr>
-          <w:rFonts w:ascii="Calibri" w:eastAsia="Calibri" w:hAnsi="Calibri" w:cs="Calibri"/>
-          <w:sz w:val="20"/>
-          <w:szCs w:val="20"/>
-        </w:rPr>
-        <w:t>LaVoie</w:t>
-      </w:r>
-      <w:proofErr w:type="spellEnd"/>
+        <w:t xml:space="preserve"> LaVoie</w:t>
+      </w:r>
       <w:r>
         <w:rPr>
           <w:rFonts w:ascii="Calibri" w:eastAsia="Calibri" w:hAnsi="Calibri" w:cs="Calibri"/>
@@ -1184,13 +1145,6 @@
         </w:rPr>
         <w:t>, Working Under Pressure</w:t>
       </w:r>
-    </w:p>
-    <w:p>
-      <w:pPr>
-        <w:rPr>
-          <w:rFonts w:ascii="Calibri" w:eastAsia="Calibri" w:hAnsi="Calibri" w:cs="Calibri"/>
-        </w:rPr>
-      </w:pPr>
     </w:p>
     <w:sectPr>
       <w:headerReference w:type="default" r:id="rId13"/>
@@ -1205,7 +1159,7 @@
 </file>
 
 <file path=word/endnotes.xml><?xml version="1.0" encoding="utf-8"?>
-<w:endnotes xmlns:wpc="http://schemas.microsoft.com/office/word/2010/wordprocessingCanvas" xmlns:cx="http://schemas.microsoft.com/office/drawing/2014/chartex" xmlns:cx1="http://schemas.microsoft.com/office/drawing/2015/9/8/chartex" xmlns:cx2="http://schemas.microsoft.com/office/drawing/2015/10/21/chartex" xmlns:cx3="http://schemas.microsoft.com/office/drawing/2016/5/9/chartex" xmlns:cx4="http://schemas.microsoft.com/office/drawing/2016/5/10/chartex" xmlns:cx5="http://schemas.microsoft.com/office/drawing/2016/5/11/chartex" xmlns:cx6="http://schemas.microsoft.com/office/drawing/2016/5/12/chartex" xmlns:cx7="http://schemas.microsoft.com/office/drawing/2016/5/13/chartex" xmlns:cx8="http://schemas.microsoft.com/office/drawing/2016/5/14/chartex" xmlns:mc="http://schemas.openxmlformats.org/markup-compatibility/2006" xmlns:aink="http://schemas.microsoft.com/office/drawing/2016/ink" xmlns:am3d="http://schemas.microsoft.com/office/drawing/2017/model3d" xmlns:o="urn:schemas-microsoft-com:office:office" xmlns:oel="http://schemas.microsoft.com/office/2019/extlst" xmlns:r="http://schemas.openxmlformats.org/officeDocument/2006/relationships" xmlns:m="http://schemas.openxmlformats.org/officeDocument/2006/math" xmlns:v="urn:schemas-microsoft-com:vml" xmlns:wp14="http://schemas.microsoft.com/office/word/2010/wordprocessingDrawing" xmlns:wp="http://schemas.openxmlformats.org/drawingml/2006/wordprocessingDrawing" xmlns:w10="urn:schemas-microsoft-com:office:word" xmlns:w="http://schemas.openxmlformats.org/wordprocessingml/2006/main" xmlns:w14="http://schemas.microsoft.com/office/word/2010/wordml" xmlns:w15="http://schemas.microsoft.com/office/word/2012/wordml" xmlns:w16cex="http://schemas.microsoft.com/office/word/2018/wordml/cex" xmlns:w16cid="http://schemas.microsoft.com/office/word/2016/wordml/cid" xmlns:w16="http://schemas.microsoft.com/office/word/2018/wordml" xmlns:w16sdtdh="http://schemas.microsoft.com/office/word/2020/wordml/sdtdatahash" xmlns:w16se="http://schemas.microsoft.com/office/word/2015/wordml/symex" xmlns:wpg="http://schemas.microsoft.com/office/word/2010/wordprocessingGroup" xmlns:wpi="http://schemas.microsoft.com/office/word/2010/wordprocessingInk" xmlns:wne="http://schemas.microsoft.com/office/word/2006/wordml" xmlns:wps="http://schemas.microsoft.com/office/word/2010/wordprocessingShape" mc:Ignorable="w14 w15 w16se w16cid w16 w16cex w16sdtdh wp14">
+<w:endnotes xmlns:wpc="http://schemas.microsoft.com/office/word/2010/wordprocessingCanvas" xmlns:cx="http://schemas.microsoft.com/office/drawing/2014/chartex" xmlns:cx1="http://schemas.microsoft.com/office/drawing/2015/9/8/chartex" xmlns:cx2="http://schemas.microsoft.com/office/drawing/2015/10/21/chartex" xmlns:cx3="http://schemas.microsoft.com/office/drawing/2016/5/9/chartex" xmlns:cx4="http://schemas.microsoft.com/office/drawing/2016/5/10/chartex" xmlns:cx5="http://schemas.microsoft.com/office/drawing/2016/5/11/chartex" xmlns:cx6="http://schemas.microsoft.com/office/drawing/2016/5/12/chartex" xmlns:cx7="http://schemas.microsoft.com/office/drawing/2016/5/13/chartex" xmlns:cx8="http://schemas.microsoft.com/office/drawing/2016/5/14/chartex" xmlns:mc="http://schemas.openxmlformats.org/markup-compatibility/2006" xmlns:aink="http://schemas.microsoft.com/office/drawing/2016/ink" xmlns:am3d="http://schemas.microsoft.com/office/drawing/2017/model3d" xmlns:o="urn:schemas-microsoft-com:office:office" xmlns:oel="http://schemas.microsoft.com/office/2019/extlst" xmlns:r="http://schemas.openxmlformats.org/officeDocument/2006/relationships" xmlns:m="http://schemas.openxmlformats.org/officeDocument/2006/math" xmlns:v="urn:schemas-microsoft-com:vml" xmlns:wp14="http://schemas.microsoft.com/office/word/2010/wordprocessingDrawing" xmlns:wp="http://schemas.openxmlformats.org/drawingml/2006/wordprocessingDrawing" xmlns:w10="urn:schemas-microsoft-com:office:word" xmlns:w="http://schemas.openxmlformats.org/wordprocessingml/2006/main" xmlns:w14="http://schemas.microsoft.com/office/word/2010/wordml" xmlns:w15="http://schemas.microsoft.com/office/word/2012/wordml" xmlns:w16cex="http://schemas.microsoft.com/office/word/2018/wordml/cex" xmlns:w16cid="http://schemas.microsoft.com/office/word/2016/wordml/cid" xmlns:w16="http://schemas.microsoft.com/office/word/2018/wordml" xmlns:w16du="http://schemas.microsoft.com/office/word/2023/wordml/word16du" xmlns:w16sdtdh="http://schemas.microsoft.com/office/word/2020/wordml/sdtdatahash" xmlns:w16sdtfl="http://schemas.microsoft.com/office/word/2024/wordml/sdtformatlock" xmlns:w16se="http://schemas.microsoft.com/office/word/2015/wordml/symex" xmlns:wpg="http://schemas.microsoft.com/office/word/2010/wordprocessingGroup" xmlns:wpi="http://schemas.microsoft.com/office/word/2010/wordprocessingInk" xmlns:wne="http://schemas.microsoft.com/office/word/2006/wordml" xmlns:wps="http://schemas.microsoft.com/office/word/2010/wordprocessingShape" mc:Ignorable="w14 w15 w16se w16cid w16 w16cex w16sdtdh w16sdtfl w16du wp14">
   <w:endnote w:type="separator" w:id="-1">
     <w:p>
       <w:pPr>
@@ -1230,7 +1184,7 @@
 </file>
 
 <file path=word/footnotes.xml><?xml version="1.0" encoding="utf-8"?>
-<w:footnotes xmlns:wpc="http://schemas.microsoft.com/office/word/2010/wordprocessingCanvas" xmlns:cx="http://schemas.microsoft.com/office/drawing/2014/chartex" xmlns:cx1="http://schemas.microsoft.com/office/drawing/2015/9/8/chartex" xmlns:cx2="http://schemas.microsoft.com/office/drawing/2015/10/21/chartex" xmlns:cx3="http://schemas.microsoft.com/office/drawing/2016/5/9/chartex" xmlns:cx4="http://schemas.microsoft.com/office/drawing/2016/5/10/chartex" xmlns:cx5="http://schemas.microsoft.com/office/drawing/2016/5/11/chartex" xmlns:cx6="http://schemas.microsoft.com/office/drawing/2016/5/12/chartex" xmlns:cx7="http://schemas.microsoft.com/office/drawing/2016/5/13/chartex" xmlns:cx8="http://schemas.microsoft.com/office/drawing/2016/5/14/chartex" xmlns:mc="http://schemas.openxmlformats.org/markup-compatibility/2006" xmlns:aink="http://schemas.microsoft.com/office/drawing/2016/ink" xmlns:am3d="http://schemas.microsoft.com/office/drawing/2017/model3d" xmlns:o="urn:schemas-microsoft-com:office:office" xmlns:oel="http://schemas.microsoft.com/office/2019/extlst" xmlns:r="http://schemas.openxmlformats.org/officeDocument/2006/relationships" xmlns:m="http://schemas.openxmlformats.org/officeDocument/2006/math" xmlns:v="urn:schemas-microsoft-com:vml" xmlns:wp14="http://schemas.microsoft.com/office/word/2010/wordprocessingDrawing" xmlns:wp="http://schemas.openxmlformats.org/drawingml/2006/wordprocessingDrawing" xmlns:w10="urn:schemas-microsoft-com:office:word" xmlns:w="http://schemas.openxmlformats.org/wordprocessingml/2006/main" xmlns:w14="http://schemas.microsoft.com/office/word/2010/wordml" xmlns:w15="http://schemas.microsoft.com/office/word/2012/wordml" xmlns:w16cex="http://schemas.microsoft.com/office/word/2018/wordml/cex" xmlns:w16cid="http://schemas.microsoft.com/office/word/2016/wordml/cid" xmlns:w16="http://schemas.microsoft.com/office/word/2018/wordml" xmlns:w16sdtdh="http://schemas.microsoft.com/office/word/2020/wordml/sdtdatahash" xmlns:w16se="http://schemas.microsoft.com/office/word/2015/wordml/symex" xmlns:wpg="http://schemas.microsoft.com/office/word/2010/wordprocessingGroup" xmlns:wpi="http://schemas.microsoft.com/office/word/2010/wordprocessingInk" xmlns:wne="http://schemas.microsoft.com/office/word/2006/wordml" xmlns:wps="http://schemas.microsoft.com/office/word/2010/wordprocessingShape" mc:Ignorable="w14 w15 w16se w16cid w16 w16cex w16sdtdh wp14">
+<w:footnotes xmlns:wpc="http://schemas.microsoft.com/office/word/2010/wordprocessingCanvas" xmlns:cx="http://schemas.microsoft.com/office/drawing/2014/chartex" xmlns:cx1="http://schemas.microsoft.com/office/drawing/2015/9/8/chartex" xmlns:cx2="http://schemas.microsoft.com/office/drawing/2015/10/21/chartex" xmlns:cx3="http://schemas.microsoft.com/office/drawing/2016/5/9/chartex" xmlns:cx4="http://schemas.microsoft.com/office/drawing/2016/5/10/chartex" xmlns:cx5="http://schemas.microsoft.com/office/drawing/2016/5/11/chartex" xmlns:cx6="http://schemas.microsoft.com/office/drawing/2016/5/12/chartex" xmlns:cx7="http://schemas.microsoft.com/office/drawing/2016/5/13/chartex" xmlns:cx8="http://schemas.microsoft.com/office/drawing/2016/5/14/chartex" xmlns:mc="http://schemas.openxmlformats.org/markup-compatibility/2006" xmlns:aink="http://schemas.microsoft.com/office/drawing/2016/ink" xmlns:am3d="http://schemas.microsoft.com/office/drawing/2017/model3d" xmlns:o="urn:schemas-microsoft-com:office:office" xmlns:oel="http://schemas.microsoft.com/office/2019/extlst" xmlns:r="http://schemas.openxmlformats.org/officeDocument/2006/relationships" xmlns:m="http://schemas.openxmlformats.org/officeDocument/2006/math" xmlns:v="urn:schemas-microsoft-com:vml" xmlns:wp14="http://schemas.microsoft.com/office/word/2010/wordprocessingDrawing" xmlns:wp="http://schemas.openxmlformats.org/drawingml/2006/wordprocessingDrawing" xmlns:w10="urn:schemas-microsoft-com:office:word" xmlns:w="http://schemas.openxmlformats.org/wordprocessingml/2006/main" xmlns:w14="http://schemas.microsoft.com/office/word/2010/wordml" xmlns:w15="http://schemas.microsoft.com/office/word/2012/wordml" xmlns:w16cex="http://schemas.microsoft.com/office/word/2018/wordml/cex" xmlns:w16cid="http://schemas.microsoft.com/office/word/2016/wordml/cid" xmlns:w16="http://schemas.microsoft.com/office/word/2018/wordml" xmlns:w16du="http://schemas.microsoft.com/office/word/2023/wordml/word16du" xmlns:w16sdtdh="http://schemas.microsoft.com/office/word/2020/wordml/sdtdatahash" xmlns:w16sdtfl="http://schemas.microsoft.com/office/word/2024/wordml/sdtformatlock" xmlns:w16se="http://schemas.microsoft.com/office/word/2015/wordml/symex" xmlns:wpg="http://schemas.microsoft.com/office/word/2010/wordprocessingGroup" xmlns:wpi="http://schemas.microsoft.com/office/word/2010/wordprocessingInk" xmlns:wne="http://schemas.microsoft.com/office/word/2006/wordml" xmlns:wps="http://schemas.microsoft.com/office/word/2010/wordprocessingShape" mc:Ignorable="w14 w15 w16se w16cid w16 w16cex w16sdtdh w16sdtfl w16du wp14">
   <w:footnote w:type="separator" w:id="-1">
     <w:p>
       <w:pPr>
@@ -1255,7 +1209,7 @@
 </file>
 
 <file path=word/header1.xml><?xml version="1.0" encoding="utf-8"?>
-<w:hdr xmlns:wpc="http://schemas.microsoft.com/office/word/2010/wordprocessingCanvas" xmlns:cx="http://schemas.microsoft.com/office/drawing/2014/chartex" xmlns:cx1="http://schemas.microsoft.com/office/drawing/2015/9/8/chartex" xmlns:cx2="http://schemas.microsoft.com/office/drawing/2015/10/21/chartex" xmlns:cx3="http://schemas.microsoft.com/office/drawing/2016/5/9/chartex" xmlns:cx4="http://schemas.microsoft.com/office/drawing/2016/5/10/chartex" xmlns:cx5="http://schemas.microsoft.com/office/drawing/2016/5/11/chartex" xmlns:cx6="http://schemas.microsoft.com/office/drawing/2016/5/12/chartex" xmlns:cx7="http://schemas.microsoft.com/office/drawing/2016/5/13/chartex" xmlns:cx8="http://schemas.microsoft.com/office/drawing/2016/5/14/chartex" xmlns:mc="http://schemas.openxmlformats.org/markup-compatibility/2006" xmlns:aink="http://schemas.microsoft.com/office/drawing/2016/ink" xmlns:am3d="http://schemas.microsoft.com/office/drawing/2017/model3d" xmlns:o="urn:schemas-microsoft-com:office:office" xmlns:oel="http://schemas.microsoft.com/office/2019/extlst" xmlns:r="http://schemas.openxmlformats.org/officeDocument/2006/relationships" xmlns:m="http://schemas.openxmlformats.org/officeDocument/2006/math" xmlns:v="urn:schemas-microsoft-com:vml" xmlns:wp14="http://schemas.microsoft.com/office/word/2010/wordprocessingDrawing" xmlns:wp="http://schemas.openxmlformats.org/drawingml/2006/wordprocessingDrawing" xmlns:w10="urn:schemas-microsoft-com:office:word" xmlns:w="http://schemas.openxmlformats.org/wordprocessingml/2006/main" xmlns:w14="http://schemas.microsoft.com/office/word/2010/wordml" xmlns:w15="http://schemas.microsoft.com/office/word/2012/wordml" xmlns:w16cex="http://schemas.microsoft.com/office/word/2018/wordml/cex" xmlns:w16cid="http://schemas.microsoft.com/office/word/2016/wordml/cid" xmlns:w16="http://schemas.microsoft.com/office/word/2018/wordml" xmlns:w16sdtdh="http://schemas.microsoft.com/office/word/2020/wordml/sdtdatahash" xmlns:w16se="http://schemas.microsoft.com/office/word/2015/wordml/symex" xmlns:wpg="http://schemas.microsoft.com/office/word/2010/wordprocessingGroup" xmlns:wpi="http://schemas.microsoft.com/office/word/2010/wordprocessingInk" xmlns:wne="http://schemas.microsoft.com/office/word/2006/wordml" xmlns:wps="http://schemas.microsoft.com/office/word/2010/wordprocessingShape" mc:Ignorable="w14 w15 w16se w16cid w16 w16cex w16sdtdh wp14">
+<w:hdr xmlns:wpc="http://schemas.microsoft.com/office/word/2010/wordprocessingCanvas" xmlns:cx="http://schemas.microsoft.com/office/drawing/2014/chartex" xmlns:cx1="http://schemas.microsoft.com/office/drawing/2015/9/8/chartex" xmlns:cx2="http://schemas.microsoft.com/office/drawing/2015/10/21/chartex" xmlns:cx3="http://schemas.microsoft.com/office/drawing/2016/5/9/chartex" xmlns:cx4="http://schemas.microsoft.com/office/drawing/2016/5/10/chartex" xmlns:cx5="http://schemas.microsoft.com/office/drawing/2016/5/11/chartex" xmlns:cx6="http://schemas.microsoft.com/office/drawing/2016/5/12/chartex" xmlns:cx7="http://schemas.microsoft.com/office/drawing/2016/5/13/chartex" xmlns:cx8="http://schemas.microsoft.com/office/drawing/2016/5/14/chartex" xmlns:mc="http://schemas.openxmlformats.org/markup-compatibility/2006" xmlns:aink="http://schemas.microsoft.com/office/drawing/2016/ink" xmlns:am3d="http://schemas.microsoft.com/office/drawing/2017/model3d" xmlns:o="urn:schemas-microsoft-com:office:office" xmlns:oel="http://schemas.microsoft.com/office/2019/extlst" xmlns:r="http://schemas.openxmlformats.org/officeDocument/2006/relationships" xmlns:m="http://schemas.openxmlformats.org/officeDocument/2006/math" xmlns:v="urn:schemas-microsoft-com:vml" xmlns:wp14="http://schemas.microsoft.com/office/word/2010/wordprocessingDrawing" xmlns:wp="http://schemas.openxmlformats.org/drawingml/2006/wordprocessingDrawing" xmlns:w10="urn:schemas-microsoft-com:office:word" xmlns:w="http://schemas.openxmlformats.org/wordprocessingml/2006/main" xmlns:w14="http://schemas.microsoft.com/office/word/2010/wordml" xmlns:w15="http://schemas.microsoft.com/office/word/2012/wordml" xmlns:w16cex="http://schemas.microsoft.com/office/word/2018/wordml/cex" xmlns:w16cid="http://schemas.microsoft.com/office/word/2016/wordml/cid" xmlns:w16="http://schemas.microsoft.com/office/word/2018/wordml" xmlns:w16du="http://schemas.microsoft.com/office/word/2023/wordml/word16du" xmlns:w16sdtdh="http://schemas.microsoft.com/office/word/2020/wordml/sdtdatahash" xmlns:w16sdtfl="http://schemas.microsoft.com/office/word/2024/wordml/sdtformatlock" xmlns:w16se="http://schemas.microsoft.com/office/word/2015/wordml/symex" xmlns:wpg="http://schemas.microsoft.com/office/word/2010/wordprocessingGroup" xmlns:wpi="http://schemas.microsoft.com/office/word/2010/wordprocessingInk" xmlns:wne="http://schemas.microsoft.com/office/word/2006/wordml" xmlns:wps="http://schemas.microsoft.com/office/word/2010/wordprocessingShape" mc:Ignorable="w14 w15 w16se w16cid w16 w16cex w16sdtdh w16sdtfl w16du wp14">
   <w:p>
     <w:pPr>
       <w:pStyle w:val="Header"/>
@@ -1275,7 +1229,7 @@
 </file>
 
 <file path=word/numbering.xml><?xml version="1.0" encoding="utf-8"?>
-<w:numbering xmlns:wpc="http://schemas.microsoft.com/office/word/2010/wordprocessingCanvas" xmlns:cx="http://schemas.microsoft.com/office/drawing/2014/chartex" xmlns:cx1="http://schemas.microsoft.com/office/drawing/2015/9/8/chartex" xmlns:cx2="http://schemas.microsoft.com/office/drawing/2015/10/21/chartex" xmlns:cx3="http://schemas.microsoft.com/office/drawing/2016/5/9/chartex" xmlns:cx4="http://schemas.microsoft.com/office/drawing/2016/5/10/chartex" xmlns:cx5="http://schemas.microsoft.com/office/drawing/2016/5/11/chartex" xmlns:cx6="http://schemas.microsoft.com/office/drawing/2016/5/12/chartex" xmlns:cx7="http://schemas.microsoft.com/office/drawing/2016/5/13/chartex" xmlns:cx8="http://schemas.microsoft.com/office/drawing/2016/5/14/chartex" xmlns:mc="http://schemas.openxmlformats.org/markup-compatibility/2006" xmlns:aink="http://schemas.microsoft.com/office/drawing/2016/ink" xmlns:am3d="http://schemas.microsoft.com/office/drawing/2017/model3d" xmlns:o="urn:schemas-microsoft-com:office:office" xmlns:oel="http://schemas.microsoft.com/office/2019/extlst" xmlns:r="http://schemas.openxmlformats.org/officeDocument/2006/relationships" xmlns:m="http://schemas.openxmlformats.org/officeDocument/2006/math" xmlns:v="urn:schemas-microsoft-com:vml" xmlns:wp14="http://schemas.microsoft.com/office/word/2010/wordprocessingDrawing" xmlns:wp="http://schemas.openxmlformats.org/drawingml/2006/wordprocessingDrawing" xmlns:w10="urn:schemas-microsoft-com:office:word" xmlns:w="http://schemas.openxmlformats.org/wordprocessingml/2006/main" xmlns:w14="http://schemas.microsoft.com/office/word/2010/wordml" xmlns:w15="http://schemas.microsoft.com/office/word/2012/wordml" xmlns:w16cex="http://schemas.microsoft.com/office/word/2018/wordml/cex" xmlns:w16cid="http://schemas.microsoft.com/office/word/2016/wordml/cid" xmlns:w16="http://schemas.microsoft.com/office/word/2018/wordml" xmlns:w16sdtdh="http://schemas.microsoft.com/office/word/2020/wordml/sdtdatahash" xmlns:w16se="http://schemas.microsoft.com/office/word/2015/wordml/symex" xmlns:wpg="http://schemas.microsoft.com/office/word/2010/wordprocessingGroup" xmlns:wpi="http://schemas.microsoft.com/office/word/2010/wordprocessingInk" xmlns:wne="http://schemas.microsoft.com/office/word/2006/wordml" xmlns:wps="http://schemas.microsoft.com/office/word/2010/wordprocessingShape" mc:Ignorable="w14 w15 w16se w16cid w16 w16cex w16sdtdh wp14">
+<w:numbering xmlns:wpc="http://schemas.microsoft.com/office/word/2010/wordprocessingCanvas" xmlns:cx="http://schemas.microsoft.com/office/drawing/2014/chartex" xmlns:cx1="http://schemas.microsoft.com/office/drawing/2015/9/8/chartex" xmlns:cx2="http://schemas.microsoft.com/office/drawing/2015/10/21/chartex" xmlns:cx3="http://schemas.microsoft.com/office/drawing/2016/5/9/chartex" xmlns:cx4="http://schemas.microsoft.com/office/drawing/2016/5/10/chartex" xmlns:cx5="http://schemas.microsoft.com/office/drawing/2016/5/11/chartex" xmlns:cx6="http://schemas.microsoft.com/office/drawing/2016/5/12/chartex" xmlns:cx7="http://schemas.microsoft.com/office/drawing/2016/5/13/chartex" xmlns:cx8="http://schemas.microsoft.com/office/drawing/2016/5/14/chartex" xmlns:mc="http://schemas.openxmlformats.org/markup-compatibility/2006" xmlns:aink="http://schemas.microsoft.com/office/drawing/2016/ink" xmlns:am3d="http://schemas.microsoft.com/office/drawing/2017/model3d" xmlns:o="urn:schemas-microsoft-com:office:office" xmlns:oel="http://schemas.microsoft.com/office/2019/extlst" xmlns:r="http://schemas.openxmlformats.org/officeDocument/2006/relationships" xmlns:m="http://schemas.openxmlformats.org/officeDocument/2006/math" xmlns:v="urn:schemas-microsoft-com:vml" xmlns:wp14="http://schemas.microsoft.com/office/word/2010/wordprocessingDrawing" xmlns:wp="http://schemas.openxmlformats.org/drawingml/2006/wordprocessingDrawing" xmlns:w10="urn:schemas-microsoft-com:office:word" xmlns:w="http://schemas.openxmlformats.org/wordprocessingml/2006/main" xmlns:w14="http://schemas.microsoft.com/office/word/2010/wordml" xmlns:w15="http://schemas.microsoft.com/office/word/2012/wordml" xmlns:w16cex="http://schemas.microsoft.com/office/word/2018/wordml/cex" xmlns:w16cid="http://schemas.microsoft.com/office/word/2016/wordml/cid" xmlns:w16="http://schemas.microsoft.com/office/word/2018/wordml" xmlns:w16du="http://schemas.microsoft.com/office/word/2023/wordml/word16du" xmlns:w16sdtdh="http://schemas.microsoft.com/office/word/2020/wordml/sdtdatahash" xmlns:w16sdtfl="http://schemas.microsoft.com/office/word/2024/wordml/sdtformatlock" xmlns:w16se="http://schemas.microsoft.com/office/word/2015/wordml/symex" xmlns:wpg="http://schemas.microsoft.com/office/word/2010/wordprocessingGroup" xmlns:wpi="http://schemas.microsoft.com/office/word/2010/wordprocessingInk" xmlns:wne="http://schemas.microsoft.com/office/word/2006/wordml" xmlns:wps="http://schemas.microsoft.com/office/word/2010/wordprocessingShape" mc:Ignorable="w14 w15 w16se w16cid w16 w16cex w16sdtdh w16sdtfl w16du wp14">
   <w:abstractNum w:abstractNumId="0" w15:restartNumberingAfterBreak="0">
     <w:nsid w:val="0AA34895"/>
     <w:multiLevelType w:val="multilevel"/>
@@ -2440,7 +2394,7 @@
 </file>
 
 <file path=word/styles.xml><?xml version="1.0" encoding="utf-8"?>
-<w:styles xmlns:mc="http://schemas.openxmlformats.org/markup-compatibility/2006" xmlns:r="http://schemas.openxmlformats.org/officeDocument/2006/relationships" xmlns:w="http://schemas.openxmlformats.org/wordprocessingml/2006/main" xmlns:w14="http://schemas.microsoft.com/office/word/2010/wordml" xmlns:w15="http://schemas.microsoft.com/office/word/2012/wordml" xmlns:w16cex="http://schemas.microsoft.com/office/word/2018/wordml/cex" xmlns:w16cid="http://schemas.microsoft.com/office/word/2016/wordml/cid" xmlns:w16="http://schemas.microsoft.com/office/word/2018/wordml" xmlns:w16sdtdh="http://schemas.microsoft.com/office/word/2020/wordml/sdtdatahash" xmlns:w16se="http://schemas.microsoft.com/office/word/2015/wordml/symex" mc:Ignorable="w14 w15 w16se w16cid w16 w16cex w16sdtdh">
+<w:styles xmlns:mc="http://schemas.openxmlformats.org/markup-compatibility/2006" xmlns:r="http://schemas.openxmlformats.org/officeDocument/2006/relationships" xmlns:w="http://schemas.openxmlformats.org/wordprocessingml/2006/main" xmlns:w14="http://schemas.microsoft.com/office/word/2010/wordml" xmlns:w15="http://schemas.microsoft.com/office/word/2012/wordml" xmlns:w16cex="http://schemas.microsoft.com/office/word/2018/wordml/cex" xmlns:w16cid="http://schemas.microsoft.com/office/word/2016/wordml/cid" xmlns:w16="http://schemas.microsoft.com/office/word/2018/wordml" xmlns:w16du="http://schemas.microsoft.com/office/word/2023/wordml/word16du" xmlns:w16sdtdh="http://schemas.microsoft.com/office/word/2020/wordml/sdtdatahash" xmlns:w16sdtfl="http://schemas.microsoft.com/office/word/2024/wordml/sdtformatlock" xmlns:w16se="http://schemas.microsoft.com/office/word/2015/wordml/symex" mc:Ignorable="w14 w15 w16se w16cid w16 w16cex w16sdtdh w16sdtfl w16du">
   <w:docDefaults>
     <w:rPrDefault>
       <w:rPr>

</xml_diff>